<commit_message>
Update project documentation and diagrams
</commit_message>
<xml_diff>
--- a/docs/Dokumentasi_TimManager_Lengkap.docx
+++ b/docs/Dokumentasi_TimManager_Lengkap.docx
@@ -24,6 +24,7 @@
     </w:p>
     <w:p>
       <w:pPr>
+        <w:pStyle w:val="Title"/>
         <w:spacing w:after="160"/>
         <w:jc w:val="center"/>
       </w:pPr>
@@ -32,10 +33,10 @@
           <w:rFonts w:ascii="Calibri" w:hAnsi="Calibri"/>
           <w:b/>
           <w:i w:val="0"/>
-          <w:color w:val="153D36"/>
+          <w:color w:val="000000"/>
           <w:sz w:val="60"/>
         </w:rPr>
-        <w:t>RuangKerja / TimManager</w:t>
+        <w:t>Dokumentasi RuangKerja</w:t>
       </w:r>
     </w:p>
     <w:p>
@@ -66,7 +67,7 @@
           <w:color w:val="64748B"/>
           <w:sz w:val="20"/>
         </w:rPr>
-        <w:t>Dokumentasi implementasi | Versi 1.2 | 4 September 2026</w:t>
+        <w:t>Dokumentasi implementasi | Versi 2.0 | 5 September 2026</w:t>
       </w:r>
     </w:p>
     <w:p/>
@@ -97,13 +98,10 @@
                 <w:color w:val="153D36"/>
                 <w:sz w:val="21"/>
               </w:rPr>
-              <w:t>Cakupan: autentikasi, profil, tim/RBAC, proyek/Kanban, multi-assignee, checklist, komentar/mention, file berversi, WhatsApp, Gmail, pencarian global, dashboard, dan ekspor laporan.</w:t>
+              <w:t>Cakupan: autentikasi, profil, superadmin global, tim dan RBAC, proyek Kanban, kolaborasi tugas, file berversi, Fonnte global, Gmail, pencarian, dashboard, laporan, dan operasi produksi.</w:t>
             </w:r>
           </w:p>
         </w:tc>
-        <w:trPr>
-          <w:tblHeader/>
-        </w:trPr>
       </w:tr>
     </w:tbl>
     <w:p>
@@ -121,8 +119,8 @@
     </w:p>
     <w:p>
       <w:pPr>
-        <w:pStyle w:val="ListNumber"/>
         <w:spacing w:after="80" w:line="300" w:lineRule="auto"/>
+        <w:ind w:left="540" w:hanging="360"/>
       </w:pPr>
       <w:r>
         <w:rPr>
@@ -132,13 +130,13 @@
           <w:color w:val="0F172A"/>
           <w:sz w:val="21"/>
         </w:rPr>
-        <w:t>Ringkasan sistem</w:t>
+        <w:t>1. Ringkasan sistem</w:t>
       </w:r>
     </w:p>
     <w:p>
       <w:pPr>
-        <w:pStyle w:val="ListNumber"/>
         <w:spacing w:after="80" w:line="300" w:lineRule="auto"/>
+        <w:ind w:left="540" w:hanging="360"/>
       </w:pPr>
       <w:r>
         <w:rPr>
@@ -148,13 +146,13 @@
           <w:color w:val="0F172A"/>
           <w:sz w:val="21"/>
         </w:rPr>
-        <w:t>Arsitektur dan sitemap</w:t>
+        <w:t>2. Arsitektur dan sitemap</w:t>
       </w:r>
     </w:p>
     <w:p>
       <w:pPr>
-        <w:pStyle w:val="ListNumber"/>
         <w:spacing w:after="80" w:line="300" w:lineRule="auto"/>
+        <w:ind w:left="540" w:hanging="360"/>
       </w:pPr>
       <w:r>
         <w:rPr>
@@ -164,13 +162,13 @@
           <w:color w:val="0F172A"/>
           <w:sz w:val="21"/>
         </w:rPr>
-        <w:t>Peran dan hak akses (RBAC)</w:t>
+        <w:t>3. Peran dan hak akses</w:t>
       </w:r>
     </w:p>
     <w:p>
       <w:pPr>
-        <w:pStyle w:val="ListNumber"/>
         <w:spacing w:after="80" w:line="300" w:lineRule="auto"/>
+        <w:ind w:left="540" w:hanging="360"/>
       </w:pPr>
       <w:r>
         <w:rPr>
@@ -180,13 +178,13 @@
           <w:color w:val="0F172A"/>
           <w:sz w:val="21"/>
         </w:rPr>
-        <w:t>Model data dan tabel database</w:t>
+        <w:t>4. Model data dan tabel database</w:t>
       </w:r>
     </w:p>
     <w:p>
       <w:pPr>
-        <w:pStyle w:val="ListNumber"/>
         <w:spacing w:after="80" w:line="300" w:lineRule="auto"/>
+        <w:ind w:left="540" w:hanging="360"/>
       </w:pPr>
       <w:r>
         <w:rPr>
@@ -196,13 +194,13 @@
           <w:color w:val="0F172A"/>
           <w:sz w:val="21"/>
         </w:rPr>
-        <w:t>Alur kerja utama</w:t>
+        <w:t>5. Alur kerja utama</w:t>
       </w:r>
     </w:p>
     <w:p>
       <w:pPr>
-        <w:pStyle w:val="ListNumber"/>
         <w:spacing w:after="80" w:line="300" w:lineRule="auto"/>
+        <w:ind w:left="540" w:hanging="360"/>
       </w:pPr>
       <w:r>
         <w:rPr>
@@ -212,13 +210,13 @@
           <w:color w:val="0F172A"/>
           <w:sz w:val="21"/>
         </w:rPr>
-        <w:t>Panduan penggunaan</w:t>
+        <w:t>6. Panduan penggunaan user</w:t>
       </w:r>
     </w:p>
     <w:p>
       <w:pPr>
-        <w:pStyle w:val="ListNumber"/>
         <w:spacing w:after="80" w:line="300" w:lineRule="auto"/>
+        <w:ind w:left="540" w:hanging="360"/>
       </w:pPr>
       <w:r>
         <w:rPr>
@@ -228,13 +226,13 @@
           <w:color w:val="0F172A"/>
           <w:sz w:val="21"/>
         </w:rPr>
-        <w:t>File, preview, versioning, dan keamanan upload</w:t>
+        <w:t>7. Panduan penggunaan superadmin</w:t>
       </w:r>
     </w:p>
     <w:p>
       <w:pPr>
-        <w:pStyle w:val="ListNumber"/>
         <w:spacing w:after="80" w:line="300" w:lineRule="auto"/>
+        <w:ind w:left="540" w:hanging="360"/>
       </w:pPr>
       <w:r>
         <w:rPr>
@@ -244,13 +242,13 @@
           <w:color w:val="0F172A"/>
           <w:sz w:val="21"/>
         </w:rPr>
-        <w:t>Email Gmail dan WhatsApp Cloud API</w:t>
+        <w:t>8. File dan keamanan upload</w:t>
       </w:r>
     </w:p>
     <w:p>
       <w:pPr>
-        <w:pStyle w:val="ListNumber"/>
         <w:spacing w:after="80" w:line="300" w:lineRule="auto"/>
+        <w:ind w:left="540" w:hanging="360"/>
       </w:pPr>
       <w:r>
         <w:rPr>
@@ -260,13 +258,13 @@
           <w:color w:val="0F172A"/>
           <w:sz w:val="21"/>
         </w:rPr>
-        <w:t>Dashboard, laporan, dan ekspor</w:t>
+        <w:t>9. Integrasi Gmail dan Fonnte</w:t>
       </w:r>
     </w:p>
     <w:p>
       <w:pPr>
-        <w:pStyle w:val="ListNumber"/>
         <w:spacing w:after="80" w:line="300" w:lineRule="auto"/>
+        <w:ind w:left="540" w:hanging="360"/>
       </w:pPr>
       <w:r>
         <w:rPr>
@@ -276,13 +274,13 @@
           <w:color w:val="0F172A"/>
           <w:sz w:val="21"/>
         </w:rPr>
-        <w:t>Konfigurasi, operasi, dan pengujian</w:t>
+        <w:t>10. Dashboard dan laporan</w:t>
       </w:r>
     </w:p>
     <w:p>
       <w:pPr>
-        <w:pStyle w:val="ListNumber"/>
         <w:spacing w:after="80" w:line="300" w:lineRule="auto"/>
+        <w:ind w:left="540" w:hanging="360"/>
       </w:pPr>
       <w:r>
         <w:rPr>
@@ -292,7 +290,23 @@
           <w:color w:val="0F172A"/>
           <w:sz w:val="21"/>
         </w:rPr>
-        <w:t>Indeks diagram Draw.io</w:t>
+        <w:t>11. Deployment dan operasi</w:t>
+      </w:r>
+    </w:p>
+    <w:p>
+      <w:pPr>
+        <w:spacing w:after="80" w:line="300" w:lineRule="auto"/>
+        <w:ind w:left="540" w:hanging="360"/>
+      </w:pPr>
+      <w:r>
+        <w:rPr>
+          <w:rFonts w:ascii="Calibri" w:hAnsi="Calibri"/>
+          <w:b w:val="0"/>
+          <w:i w:val="0"/>
+          <w:color w:val="0F172A"/>
+          <w:sz w:val="21"/>
+        </w:rPr>
+        <w:t>12. Indeks diagram Draw.io</w:t>
       </w:r>
     </w:p>
     <w:p>
@@ -300,7 +314,7 @@
         <w:pStyle w:val="Heading1"/>
       </w:pPr>
       <w:r>
-        <w:t>1. Ringkasan Sistem</w:t>
+        <w:t>Ringkasan Sistem</w:t>
       </w:r>
     </w:p>
     <w:p>
@@ -322,6 +336,9 @@
         <w:gridCol w:w="7560"/>
       </w:tblGrid>
       <w:tr>
+        <w:trPr>
+          <w:tblHeader w:val="true"/>
+        </w:trPr>
         <w:tc>
           <w:tcPr>
             <w:tcW w:type="dxa" w:w="1800"/>
@@ -360,9 +377,6 @@
             </w:r>
           </w:p>
         </w:tc>
-        <w:trPr>
-          <w:tblHeader/>
-        </w:trPr>
       </w:tr>
       <w:tr>
         <w:tc>
@@ -587,7 +601,7 @@
                 <w:color w:val="0F172A"/>
                 <w:sz w:val="18"/>
               </w:rPr>
-              <w:t>Gmail SMTP untuk undangan dan WhatsApp Cloud API per pengguna.</w:t>
+              <w:t>Gmail SMTP untuk undangan dan satu API key Fonnte global untuk notifikasi WhatsApp.</w:t>
             </w:r>
           </w:p>
         </w:tc>
@@ -637,7 +651,7 @@
         <w:pStyle w:val="Heading1"/>
       </w:pPr>
       <w:r>
-        <w:t>2. Arsitektur dan Sitemap</w:t>
+        <w:t>Arsitektur dan Sitemap</w:t>
       </w:r>
     </w:p>
     <w:p>
@@ -706,7 +720,7 @@
           <w:color w:val="0F172A"/>
           <w:sz w:val="21"/>
         </w:rPr>
-        <w:t>Infrastructure: MySQL/SQLite test, local private storage, SMTP Gmail, WhatsApp Graph API, queue, dan scheduler.</w:t>
+        <w:t>Infrastructure: MySQL atau SQLite untuk test, storage privat, SMTP Gmail, Fonnte Send API, queue database, dan scheduler.</w:t>
       </w:r>
     </w:p>
     <w:p>
@@ -731,6 +745,9 @@
         <w:gridCol w:w="6360"/>
       </w:tblGrid>
       <w:tr>
+        <w:trPr>
+          <w:tblHeader w:val="true"/>
+        </w:trPr>
         <w:tc>
           <w:tcPr>
             <w:tcW w:type="dxa" w:w="3000"/>
@@ -769,9 +786,6 @@
             </w:r>
           </w:p>
         </w:tc>
-        <w:trPr>
-          <w:tblHeader/>
-        </w:trPr>
       </w:tr>
       <w:tr>
         <w:tc>
@@ -958,7 +972,45 @@
                 <w:color w:val="0F172A"/>
                 <w:sz w:val="18"/>
               </w:rPr>
-              <w:t>Profil, avatar, kata sandi, dan pengaturan WhatsApp.</w:t>
+              <w:t>Profil, avatar, kata sandi, dan pengaturan penerima WhatsApp.</w:t>
+            </w:r>
+          </w:p>
+        </w:tc>
+      </w:tr>
+      <w:tr>
+        <w:tc>
+          <w:tcPr>
+            <w:tcW w:type="dxa" w:w="3000"/>
+            <w:vAlign w:val="center"/>
+          </w:tcPr>
+          <w:p>
+            <w:r>
+              <w:rPr>
+                <w:rFonts w:ascii="Calibri" w:hAnsi="Calibri"/>
+                <w:b w:val="0"/>
+                <w:i w:val="0"/>
+                <w:color w:val="0F172A"/>
+                <w:sz w:val="18"/>
+              </w:rPr>
+              <w:t>/admin</w:t>
+            </w:r>
+          </w:p>
+        </w:tc>
+        <w:tc>
+          <w:tcPr>
+            <w:tcW w:type="dxa" w:w="6360"/>
+            <w:vAlign w:val="center"/>
+          </w:tcPr>
+          <w:p>
+            <w:r>
+              <w:rPr>
+                <w:rFonts w:ascii="Calibri" w:hAnsi="Calibri"/>
+                <w:b w:val="0"/>
+                <w:i w:val="0"/>
+                <w:color w:val="0F172A"/>
+                <w:sz w:val="18"/>
+              </w:rPr>
+              <w:t>Dashboard khusus superadmin untuk statistik, pengguna, dan audit akses.</w:t>
             </w:r>
           </w:p>
         </w:tc>
@@ -1236,7 +1288,162 @@
         <w:pStyle w:val="Heading1"/>
       </w:pPr>
       <w:r>
-        <w:t>3. Peran dan Hak Akses (RBAC)</w:t>
+        <w:t>Peran dan Hak Akses</w:t>
+      </w:r>
+    </w:p>
+    <w:p>
+      <w:pPr>
+        <w:pStyle w:val="Heading2"/>
+      </w:pPr>
+      <w:r>
+        <w:t>Role global</w:t>
+      </w:r>
+    </w:p>
+    <w:tbl>
+      <w:tblPr>
+        <w:tblStyle w:val="TableGrid"/>
+        <w:tblW w:type="dxa" w:w="9360"/>
+        <w:jc w:val="left"/>
+        <w:tblLayout w:type="fixed"/>
+        <w:tblLook w:firstColumn="1" w:firstRow="1" w:lastColumn="0" w:lastRow="0" w:noHBand="0" w:noVBand="1" w:val="04A0"/>
+        <w:tblInd w:w="120" w:type="dxa"/>
+      </w:tblPr>
+      <w:tblGrid>
+        <w:gridCol w:w="2200"/>
+        <w:gridCol w:w="7160"/>
+      </w:tblGrid>
+      <w:tr>
+        <w:trPr>
+          <w:tblHeader w:val="true"/>
+        </w:trPr>
+        <w:tc>
+          <w:tcPr>
+            <w:tcW w:type="dxa" w:w="2200"/>
+            <w:shd w:fill="E8EEF5"/>
+            <w:vAlign w:val="center"/>
+          </w:tcPr>
+          <w:p>
+            <w:r>
+              <w:rPr>
+                <w:rFonts w:ascii="Calibri" w:hAnsi="Calibri"/>
+                <w:b/>
+                <w:i w:val="0"/>
+                <w:color w:val="1F4D78"/>
+                <w:sz w:val="19"/>
+              </w:rPr>
+              <w:t>Role</w:t>
+            </w:r>
+          </w:p>
+        </w:tc>
+        <w:tc>
+          <w:tcPr>
+            <w:tcW w:type="dxa" w:w="7160"/>
+            <w:shd w:fill="E8EEF5"/>
+            <w:vAlign w:val="center"/>
+          </w:tcPr>
+          <w:p>
+            <w:r>
+              <w:rPr>
+                <w:rFonts w:ascii="Calibri" w:hAnsi="Calibri"/>
+                <w:b/>
+                <w:i w:val="0"/>
+                <w:color w:val="1F4D78"/>
+                <w:sz w:val="19"/>
+              </w:rPr>
+              <w:t>Akses</w:t>
+            </w:r>
+          </w:p>
+        </w:tc>
+      </w:tr>
+      <w:tr>
+        <w:tc>
+          <w:tcPr>
+            <w:tcW w:type="dxa" w:w="2200"/>
+            <w:vAlign w:val="center"/>
+          </w:tcPr>
+          <w:p>
+            <w:r>
+              <w:rPr>
+                <w:rFonts w:ascii="Calibri" w:hAnsi="Calibri"/>
+                <w:b w:val="0"/>
+                <w:i w:val="0"/>
+                <w:color w:val="0F172A"/>
+                <w:sz w:val="18"/>
+              </w:rPr>
+              <w:t>User</w:t>
+            </w:r>
+          </w:p>
+        </w:tc>
+        <w:tc>
+          <w:tcPr>
+            <w:tcW w:type="dxa" w:w="7160"/>
+            <w:vAlign w:val="center"/>
+          </w:tcPr>
+          <w:p>
+            <w:r>
+              <w:rPr>
+                <w:rFonts w:ascii="Calibri" w:hAnsi="Calibri"/>
+                <w:b w:val="0"/>
+                <w:i w:val="0"/>
+                <w:color w:val="0F172A"/>
+                <w:sz w:val="18"/>
+              </w:rPr>
+              <w:t>Mengakses tim, proyek, tugas, file, laporan, dan profil sesuai keanggotaan.</w:t>
+            </w:r>
+          </w:p>
+        </w:tc>
+      </w:tr>
+      <w:tr>
+        <w:tc>
+          <w:tcPr>
+            <w:tcW w:type="dxa" w:w="2200"/>
+            <w:vAlign w:val="center"/>
+          </w:tcPr>
+          <w:p>
+            <w:r>
+              <w:rPr>
+                <w:rFonts w:ascii="Calibri" w:hAnsi="Calibri"/>
+                <w:b w:val="0"/>
+                <w:i w:val="0"/>
+                <w:color w:val="0F172A"/>
+                <w:sz w:val="18"/>
+              </w:rPr>
+              <w:t>Superadmin</w:t>
+            </w:r>
+          </w:p>
+        </w:tc>
+        <w:tc>
+          <w:tcPr>
+            <w:tcW w:type="dxa" w:w="7160"/>
+            <w:vAlign w:val="center"/>
+          </w:tcPr>
+          <w:p>
+            <w:r>
+              <w:rPr>
+                <w:rFonts w:ascii="Calibri" w:hAnsi="Calibri"/>
+                <w:b w:val="0"/>
+                <w:i w:val="0"/>
+                <w:color w:val="0F172A"/>
+                <w:sz w:val="18"/>
+              </w:rPr>
+              <w:t>Memiliki akses tambahan ke /admin untuk statistik platform, pengelolaan role global, status akun, dan audit.</w:t>
+            </w:r>
+          </w:p>
+        </w:tc>
+      </w:tr>
+    </w:tbl>
+    <w:p/>
+    <w:p>
+      <w:r>
+        <w:t>Role global tidak menggantikan role per tim. Seorang superadmin tetap mengikuti aturan owner, admin, atau member ketika mengelola resource tim.</w:t>
+      </w:r>
+    </w:p>
+    <w:p>
+      <w:pPr>
+        <w:pStyle w:val="Heading2"/>
+      </w:pPr>
+      <w:r>
+        <w:t>Role per tim</w:t>
       </w:r>
     </w:p>
     <w:tbl>
@@ -1255,6 +1462,9 @@
         <w:gridCol w:w="1750"/>
       </w:tblGrid>
       <w:tr>
+        <w:trPr>
+          <w:tblHeader w:val="true"/>
+        </w:trPr>
         <w:tc>
           <w:tcPr>
             <w:tcW w:type="dxa" w:w="4110"/>
@@ -1331,9 +1541,6 @@
             </w:r>
           </w:p>
         </w:tc>
-        <w:trPr>
-          <w:tblHeader/>
-        </w:trPr>
       </w:tr>
       <w:tr>
         <w:tc>
@@ -2005,7 +2212,7 @@
     <w:p/>
     <w:p>
       <w:r>
-        <w:t>Resource lintas tim umumnya dikembalikan sebagai HTTP 404 agar keberadaan data tidak terungkap. ID assignee dan mention diverifikasi sebagai anggota tim.</w:t>
+        <w:t>Resource lintas tim umumnya dikembalikan sebagai HTTP 404 agar keberadaan data tidak terungkap. ID assignee dan mention diverifikasi sebagai anggota tim. Akun dengan is_active bernilai false tidak dapat login. Sistem melindungi superadmin aktif terakhir agar tidak diturunkan atau dinonaktifkan.</w:t>
       </w:r>
     </w:p>
     <w:p>
@@ -2013,7 +2220,7 @@
         <w:pStyle w:val="Heading1"/>
       </w:pPr>
       <w:r>
-        <w:t>4. Model Data dan Tabel Database</w:t>
+        <w:t>Model Data dan Tabel Database</w:t>
       </w:r>
     </w:p>
     <w:tbl>
@@ -2030,6 +2237,9 @@
         <w:gridCol w:w="6360"/>
       </w:tblGrid>
       <w:tr>
+        <w:trPr>
+          <w:tblHeader w:val="true"/>
+        </w:trPr>
         <w:tc>
           <w:tcPr>
             <w:tcW w:type="dxa" w:w="3000"/>
@@ -2068,9 +2278,6 @@
             </w:r>
           </w:p>
         </w:tc>
-        <w:trPr>
-          <w:tblHeader/>
-        </w:trPr>
       </w:tr>
       <w:tr>
         <w:tc>
@@ -2105,7 +2312,45 @@
                 <w:color w:val="0F172A"/>
                 <w:sz w:val="18"/>
               </w:rPr>
-              <w:t>Akun, profil, avatar, kredensial.</w:t>
+              <w:t>Akun, profil, avatar, global_role, is_active, dan kredensial.</w:t>
+            </w:r>
+          </w:p>
+        </w:tc>
+      </w:tr>
+      <w:tr>
+        <w:tc>
+          <w:tcPr>
+            <w:tcW w:type="dxa" w:w="3000"/>
+            <w:vAlign w:val="center"/>
+          </w:tcPr>
+          <w:p>
+            <w:r>
+              <w:rPr>
+                <w:rFonts w:ascii="Calibri" w:hAnsi="Calibri"/>
+                <w:b w:val="0"/>
+                <w:i w:val="0"/>
+                <w:color w:val="0F172A"/>
+                <w:sz w:val="18"/>
+              </w:rPr>
+              <w:t>admin_audit_logs</w:t>
+            </w:r>
+          </w:p>
+        </w:tc>
+        <w:tc>
+          <w:tcPr>
+            <w:tcW w:type="dxa" w:w="6360"/>
+            <w:vAlign w:val="center"/>
+          </w:tcPr>
+          <w:p>
+            <w:r>
+              <w:rPr>
+                <w:rFonts w:ascii="Calibri" w:hAnsi="Calibri"/>
+                <w:b w:val="0"/>
+                <w:i w:val="0"/>
+                <w:color w:val="0F172A"/>
+                <w:sz w:val="18"/>
+              </w:rPr>
+              <w:t>Actor, target user, action, before/after, IP, dan user agent.</w:t>
             </w:r>
           </w:p>
         </w:tc>
@@ -2675,7 +2920,7 @@
                 <w:color w:val="0F172A"/>
                 <w:sz w:val="18"/>
               </w:rPr>
-              <w:t>Token terenkripsi, preferensi, quiet hours.</w:t>
+              <w:t>Nomor penerima, consent, preferensi, timezone, dan quiet hours.</w:t>
             </w:r>
           </w:p>
         </w:tc>
@@ -2940,6 +3185,22 @@
     </w:p>
     <w:p>
       <w:pPr>
+        <w:pStyle w:val="ListBullet"/>
+        <w:spacing w:after="80" w:line="300" w:lineRule="auto"/>
+      </w:pPr>
+      <w:r>
+        <w:rPr>
+          <w:rFonts w:ascii="Calibri" w:hAnsi="Calibri"/>
+          <w:b w:val="0"/>
+          <w:i w:val="0"/>
+          <w:color w:val="0F172A"/>
+          <w:sz w:val="21"/>
+        </w:rPr>
+        <w:t>User dapat menjadi actor atau target pada AdminAuditLog. API key Fonnte tidak disimpan pada record user.</w:t>
+      </w:r>
+    </w:p>
+    <w:p>
+      <w:pPr>
         <w:pStyle w:val="Heading2"/>
       </w:pPr>
       <w:r>
@@ -3015,7 +3276,7 @@
         <w:pStyle w:val="Heading1"/>
       </w:pPr>
       <w:r>
-        <w:t>5. Alur Kerja Utama</w:t>
+        <w:t>Alur Kerja Utama</w:t>
       </w:r>
     </w:p>
     <w:p>
@@ -3028,8 +3289,8 @@
     </w:p>
     <w:p>
       <w:pPr>
-        <w:pStyle w:val="ListNumber"/>
         <w:spacing w:after="80" w:line="300" w:lineRule="auto"/>
+        <w:ind w:left="540" w:hanging="360"/>
       </w:pPr>
       <w:r>
         <w:rPr>
@@ -3039,13 +3300,13 @@
           <w:color w:val="0F172A"/>
           <w:sz w:val="21"/>
         </w:rPr>
-        <w:t>Anggota membuka proyek yang dapat diakses.</w:t>
+        <w:t>1. Anggota membuka proyek yang dapat diakses.</w:t>
       </w:r>
     </w:p>
     <w:p>
       <w:pPr>
-        <w:pStyle w:val="ListNumber"/>
         <w:spacing w:after="80" w:line="300" w:lineRule="auto"/>
+        <w:ind w:left="540" w:hanging="360"/>
       </w:pPr>
       <w:r>
         <w:rPr>
@@ -3055,13 +3316,13 @@
           <w:color w:val="0F172A"/>
           <w:sz w:val="21"/>
         </w:rPr>
-        <w:t>Mengisi list, judul, deskripsi, prioritas, tenggat, multi-assignee, dan lampiran.</w:t>
+        <w:t>2. Mengisi list, judul, deskripsi, prioritas, tenggat, multi-assignee, dan lampiran.</w:t>
       </w:r>
     </w:p>
     <w:p>
       <w:pPr>
-        <w:pStyle w:val="ListNumber"/>
         <w:spacing w:after="80" w:line="300" w:lineRule="auto"/>
+        <w:ind w:left="540" w:hanging="360"/>
       </w:pPr>
       <w:r>
         <w:rPr>
@@ -3071,13 +3332,13 @@
           <w:color w:val="0F172A"/>
           <w:sz w:val="21"/>
         </w:rPr>
-        <w:t>Server memvalidasi board, list, anggota, field, dan file.</w:t>
+        <w:t>3. Server memvalidasi board, list, anggota, field, dan file.</w:t>
       </w:r>
     </w:p>
     <w:p>
       <w:pPr>
-        <w:pStyle w:val="ListNumber"/>
         <w:spacing w:after="80" w:line="300" w:lineRule="auto"/>
+        <w:ind w:left="540" w:hanging="360"/>
       </w:pPr>
       <w:r>
         <w:rPr>
@@ -3087,13 +3348,13 @@
           <w:color w:val="0F172A"/>
           <w:sz w:val="21"/>
         </w:rPr>
-        <w:t>Task, pivot assignee, attachment, dan activity created disimpan dalam transaksi.</w:t>
+        <w:t>4. Task, pivot assignee, attachment, dan activity created disimpan dalam transaksi.</w:t>
       </w:r>
     </w:p>
     <w:p>
       <w:pPr>
-        <w:pStyle w:val="ListNumber"/>
         <w:spacing w:after="80" w:line="300" w:lineRule="auto"/>
+        <w:ind w:left="540" w:hanging="360"/>
       </w:pPr>
       <w:r>
         <w:rPr>
@@ -3103,13 +3364,13 @@
           <w:color w:val="0F172A"/>
           <w:sz w:val="21"/>
         </w:rPr>
-        <w:t>Notifikasi WhatsApp dibuat sesuai koneksi, preferensi, dan quiet hours.</w:t>
+        <w:t>5. Notifikasi WhatsApp dibuat sesuai koneksi, preferensi, dan quiet hours.</w:t>
       </w:r>
     </w:p>
     <w:p>
       <w:pPr>
-        <w:pStyle w:val="ListNumber"/>
         <w:spacing w:after="80" w:line="300" w:lineRule="auto"/>
+        <w:ind w:left="540" w:hanging="360"/>
       </w:pPr>
       <w:r>
         <w:rPr>
@@ -3119,7 +3380,7 @@
           <w:color w:val="0F172A"/>
           <w:sz w:val="21"/>
         </w:rPr>
-        <w:t>Kartu dapat dipindahkan antar-list; detail tugas memuat checklist, komentar, mention, file, dan activity log.</w:t>
+        <w:t>6. Kartu dapat dipindahkan antar-list; detail tugas memuat checklist, komentar, mention, file, dan activity log.</w:t>
       </w:r>
     </w:p>
     <w:p>
@@ -3132,8 +3393,8 @@
     </w:p>
     <w:p>
       <w:pPr>
-        <w:pStyle w:val="ListNumber"/>
         <w:spacing w:after="80" w:line="300" w:lineRule="auto"/>
+        <w:ind w:left="540" w:hanging="360"/>
       </w:pPr>
       <w:r>
         <w:rPr>
@@ -3143,13 +3404,13 @@
           <w:color w:val="0F172A"/>
           <w:sz w:val="21"/>
         </w:rPr>
-        <w:t>Validasi jumlah, ukuran maksimum 10 MB, MIME, dan ekstensi whitelist.</w:t>
+        <w:t>1. Validasi jumlah, ukuran maksimum 10 MB, MIME, dan ekstensi whitelist.</w:t>
       </w:r>
     </w:p>
     <w:p>
       <w:pPr>
-        <w:pStyle w:val="ListNumber"/>
         <w:spacing w:after="80" w:line="300" w:lineRule="auto"/>
+        <w:ind w:left="540" w:hanging="360"/>
       </w:pPr>
       <w:r>
         <w:rPr>
@@ -3159,13 +3420,13 @@
           <w:color w:val="0F172A"/>
           <w:sz w:val="21"/>
         </w:rPr>
-        <w:t>Jika antivirus aktif, file dipindai sebelum masuk storage.</w:t>
+        <w:t>2. Jika antivirus aktif, file dipindai sebelum masuk storage.</w:t>
       </w:r>
     </w:p>
     <w:p>
       <w:pPr>
-        <w:pStyle w:val="ListNumber"/>
         <w:spacing w:after="80" w:line="300" w:lineRule="auto"/>
+        <w:ind w:left="540" w:hanging="360"/>
       </w:pPr>
       <w:r>
         <w:rPr>
@@ -3175,13 +3436,13 @@
           <w:color w:val="0F172A"/>
           <w:sz w:val="21"/>
         </w:rPr>
-        <w:t>File disimpan pada disk local privat beserta metadata scan.</w:t>
+        <w:t>3. File disimpan pada disk local privat beserta metadata scan.</w:t>
       </w:r>
     </w:p>
     <w:p>
       <w:pPr>
-        <w:pStyle w:val="ListNumber"/>
         <w:spacing w:after="80" w:line="300" w:lineRule="auto"/>
+        <w:ind w:left="540" w:hanging="360"/>
       </w:pPr>
       <w:r>
         <w:rPr>
@@ -3191,13 +3452,13 @@
           <w:color w:val="0F172A"/>
           <w:sz w:val="21"/>
         </w:rPr>
-        <w:t>Versi baru wajib memiliki ekstensi yang sama.</w:t>
+        <w:t>4. Versi baru wajib memiliki ekstensi yang sama.</w:t>
       </w:r>
     </w:p>
     <w:p>
       <w:pPr>
-        <w:pStyle w:val="ListNumber"/>
         <w:spacing w:after="80" w:line="300" w:lineRule="auto"/>
+        <w:ind w:left="540" w:hanging="360"/>
       </w:pPr>
       <w:r>
         <w:rPr>
@@ -3207,13 +3468,13 @@
           <w:color w:val="0F172A"/>
           <w:sz w:val="21"/>
         </w:rPr>
-        <w:t>Versi sebelumnya menjadi tidak aktif dan versi terbaru menjadi is_current.</w:t>
+        <w:t>5. Versi sebelumnya menjadi tidak aktif dan versi terbaru menjadi is_current.</w:t>
       </w:r>
     </w:p>
     <w:p>
       <w:pPr>
-        <w:pStyle w:val="ListNumber"/>
         <w:spacing w:after="80" w:line="300" w:lineRule="auto"/>
+        <w:ind w:left="540" w:hanging="360"/>
       </w:pPr>
       <w:r>
         <w:rPr>
@@ -3223,7 +3484,7 @@
           <w:color w:val="0F172A"/>
           <w:sz w:val="21"/>
         </w:rPr>
-        <w:t>Preview/download memeriksa membership dan download_permission.</w:t>
+        <w:t>6. Preview/download memeriksa membership dan download_permission.</w:t>
       </w:r>
     </w:p>
     <w:p>
@@ -3236,7 +3497,636 @@
     </w:p>
     <w:p>
       <w:pPr>
-        <w:pStyle w:val="ListNumber"/>
+        <w:spacing w:after="80" w:line="300" w:lineRule="auto"/>
+        <w:ind w:left="540" w:hanging="360"/>
+      </w:pPr>
+      <w:r>
+        <w:rPr>
+          <w:rFonts w:ascii="Calibri" w:hAnsi="Calibri"/>
+          <w:b w:val="0"/>
+          <w:i w:val="0"/>
+          <w:color w:val="0F172A"/>
+          <w:sz w:val="21"/>
+        </w:rPr>
+        <w:t>1. Event aplikasi membentuk pesan notifikasi.</w:t>
+      </w:r>
+    </w:p>
+    <w:p>
+      <w:pPr>
+        <w:spacing w:after="80" w:line="300" w:lineRule="auto"/>
+        <w:ind w:left="540" w:hanging="360"/>
+      </w:pPr>
+      <w:r>
+        <w:rPr>
+          <w:rFonts w:ascii="Calibri" w:hAnsi="Calibri"/>
+          <w:b w:val="0"/>
+          <w:i w:val="0"/>
+          <w:color w:val="0F172A"/>
+          <w:sz w:val="21"/>
+        </w:rPr>
+        <w:t>2. Preferensi dan status koneksi diperiksa.</w:t>
+      </w:r>
+    </w:p>
+    <w:p>
+      <w:pPr>
+        <w:spacing w:after="80" w:line="300" w:lineRule="auto"/>
+        <w:ind w:left="540" w:hanging="360"/>
+      </w:pPr>
+      <w:r>
+        <w:rPr>
+          <w:rFonts w:ascii="Calibri" w:hAnsi="Calibri"/>
+          <w:b w:val="0"/>
+          <w:i w:val="0"/>
+          <w:color w:val="0F172A"/>
+          <w:sz w:val="21"/>
+        </w:rPr>
+        <w:t>3. Quiet hours menentukan waktu pengiriman.</w:t>
+      </w:r>
+    </w:p>
+    <w:p>
+      <w:pPr>
+        <w:spacing w:after="80" w:line="300" w:lineRule="auto"/>
+        <w:ind w:left="540" w:hanging="360"/>
+      </w:pPr>
+      <w:r>
+        <w:rPr>
+          <w:rFonts w:ascii="Calibri" w:hAnsi="Calibri"/>
+          <w:b w:val="0"/>
+          <w:i w:val="0"/>
+          <w:color w:val="0F172A"/>
+          <w:sz w:val="21"/>
+        </w:rPr>
+        <w:t>4. Log pending dibuat dengan idempotency key; job masuk queue.</w:t>
+      </w:r>
+    </w:p>
+    <w:p>
+      <w:pPr>
+        <w:spacing w:after="80" w:line="300" w:lineRule="auto"/>
+        <w:ind w:left="540" w:hanging="360"/>
+      </w:pPr>
+      <w:r>
+        <w:rPr>
+          <w:rFonts w:ascii="Calibri" w:hAnsi="Calibri"/>
+          <w:b w:val="0"/>
+          <w:i w:val="0"/>
+          <w:color w:val="0F172A"/>
+          <w:sz w:val="21"/>
+        </w:rPr>
+        <w:t>5. Job memakai FONNTE_API_KEY global untuk memanggil Fonnte Send API dan mencatat sent, failed, atau skipped.</w:t>
+      </w:r>
+    </w:p>
+    <w:p>
+      <w:pPr>
+        <w:spacing w:after="80" w:line="300" w:lineRule="auto"/>
+        <w:ind w:left="540" w:hanging="360"/>
+      </w:pPr>
+      <w:r>
+        <w:rPr>
+          <w:rFonts w:ascii="Calibri" w:hAnsi="Calibri"/>
+          <w:b w:val="0"/>
+          <w:i w:val="0"/>
+          <w:color w:val="0F172A"/>
+          <w:sz w:val="21"/>
+        </w:rPr>
+        <w:t>6. Email undangan dikirim via SMTP dan dicatat di email_notification_logs.</w:t>
+      </w:r>
+    </w:p>
+    <w:p>
+      <w:pPr>
+        <w:pStyle w:val="Heading1"/>
+      </w:pPr>
+      <w:r>
+        <w:t>Panduan Penggunaan User</w:t>
+      </w:r>
+    </w:p>
+    <w:p>
+      <w:pPr>
+        <w:pStyle w:val="Heading2"/>
+      </w:pPr>
+      <w:r>
+        <w:t>Memulai</w:t>
+      </w:r>
+    </w:p>
+    <w:p>
+      <w:pPr>
+        <w:spacing w:after="80" w:line="300" w:lineRule="auto"/>
+        <w:ind w:left="540" w:hanging="360"/>
+      </w:pPr>
+      <w:r>
+        <w:rPr>
+          <w:rFonts w:ascii="Calibri" w:hAnsi="Calibri"/>
+          <w:b w:val="0"/>
+          <w:i w:val="0"/>
+          <w:color w:val="0F172A"/>
+          <w:sz w:val="21"/>
+        </w:rPr>
+        <w:t>1. Registrasi lalu login.</w:t>
+      </w:r>
+    </w:p>
+    <w:p>
+      <w:pPr>
+        <w:spacing w:after="80" w:line="300" w:lineRule="auto"/>
+        <w:ind w:left="540" w:hanging="360"/>
+      </w:pPr>
+      <w:r>
+        <w:rPr>
+          <w:rFonts w:ascii="Calibri" w:hAnsi="Calibri"/>
+          <w:b w:val="0"/>
+          <w:i w:val="0"/>
+          <w:color w:val="0F172A"/>
+          <w:sz w:val="21"/>
+        </w:rPr>
+        <w:t>2. Lengkapi profil, jabatan, telepon, bio, avatar, dan kata sandi.</w:t>
+      </w:r>
+    </w:p>
+    <w:p>
+      <w:pPr>
+        <w:spacing w:after="80" w:line="300" w:lineRule="auto"/>
+        <w:ind w:left="540" w:hanging="360"/>
+      </w:pPr>
+      <w:r>
+        <w:rPr>
+          <w:rFonts w:ascii="Calibri" w:hAnsi="Calibri"/>
+          <w:b w:val="0"/>
+          <w:i w:val="0"/>
+          <w:color w:val="0F172A"/>
+          <w:sz w:val="21"/>
+        </w:rPr>
+        <w:t>3. Buat tim; pembuat otomatis menjadi Owner.</w:t>
+      </w:r>
+    </w:p>
+    <w:p>
+      <w:pPr>
+        <w:spacing w:after="80" w:line="300" w:lineRule="auto"/>
+        <w:ind w:left="540" w:hanging="360"/>
+      </w:pPr>
+      <w:r>
+        <w:rPr>
+          <w:rFonts w:ascii="Calibri" w:hAnsi="Calibri"/>
+          <w:b w:val="0"/>
+          <w:i w:val="0"/>
+          <w:color w:val="0F172A"/>
+          <w:sz w:val="21"/>
+        </w:rPr>
+        <w:t>4. Undang anggota lewat Gmail atau tambahkan akun terdaftar.</w:t>
+      </w:r>
+    </w:p>
+    <w:p>
+      <w:pPr>
+        <w:spacing w:after="80" w:line="300" w:lineRule="auto"/>
+        <w:ind w:left="540" w:hanging="360"/>
+      </w:pPr>
+      <w:r>
+        <w:rPr>
+          <w:rFonts w:ascii="Calibri" w:hAnsi="Calibri"/>
+          <w:b w:val="0"/>
+          <w:i w:val="0"/>
+          <w:color w:val="0F172A"/>
+          <w:sz w:val="21"/>
+        </w:rPr>
+        <w:t>5. Buat proyek pada tim yang dikelola.</w:t>
+      </w:r>
+    </w:p>
+    <w:p>
+      <w:pPr>
+        <w:pStyle w:val="Heading2"/>
+      </w:pPr>
+      <w:r>
+        <w:t>Kanban dan tugas</w:t>
+      </w:r>
+    </w:p>
+    <w:p>
+      <w:pPr>
+        <w:spacing w:after="80" w:line="300" w:lineRule="auto"/>
+        <w:ind w:left="540" w:hanging="360"/>
+      </w:pPr>
+      <w:r>
+        <w:rPr>
+          <w:rFonts w:ascii="Calibri" w:hAnsi="Calibri"/>
+          <w:b w:val="0"/>
+          <w:i w:val="0"/>
+          <w:color w:val="0F172A"/>
+          <w:sz w:val="21"/>
+        </w:rPr>
+        <w:t>1. Buka proyek dan pilih Buat tugas.</w:t>
+      </w:r>
+    </w:p>
+    <w:p>
+      <w:pPr>
+        <w:spacing w:after="80" w:line="300" w:lineRule="auto"/>
+        <w:ind w:left="540" w:hanging="360"/>
+      </w:pPr>
+      <w:r>
+        <w:rPr>
+          <w:rFonts w:ascii="Calibri" w:hAnsi="Calibri"/>
+          <w:b w:val="0"/>
+          <w:i w:val="0"/>
+          <w:color w:val="0F172A"/>
+          <w:sz w:val="21"/>
+        </w:rPr>
+        <w:t>2. Pilih satu atau beberapa penanggung jawab.</w:t>
+      </w:r>
+    </w:p>
+    <w:p>
+      <w:pPr>
+        <w:spacing w:after="80" w:line="300" w:lineRule="auto"/>
+        <w:ind w:left="540" w:hanging="360"/>
+      </w:pPr>
+      <w:r>
+        <w:rPr>
+          <w:rFonts w:ascii="Calibri" w:hAnsi="Calibri"/>
+          <w:b w:val="0"/>
+          <w:i w:val="0"/>
+          <w:color w:val="0F172A"/>
+          <w:sz w:val="21"/>
+        </w:rPr>
+        <w:t>3. Gunakan filter teks, anggota, prioritas, dan tenggat.</w:t>
+      </w:r>
+    </w:p>
+    <w:p>
+      <w:pPr>
+        <w:spacing w:after="80" w:line="300" w:lineRule="auto"/>
+        <w:ind w:left="540" w:hanging="360"/>
+      </w:pPr>
+      <w:r>
+        <w:rPr>
+          <w:rFonts w:ascii="Calibri" w:hAnsi="Calibri"/>
+          <w:b w:val="0"/>
+          <w:i w:val="0"/>
+          <w:color w:val="0F172A"/>
+          <w:sz w:val="21"/>
+        </w:rPr>
+        <w:t>4. Seret kartu untuk memperbarui status.</w:t>
+      </w:r>
+    </w:p>
+    <w:p>
+      <w:pPr>
+        <w:spacing w:after="80" w:line="300" w:lineRule="auto"/>
+        <w:ind w:left="540" w:hanging="360"/>
+      </w:pPr>
+      <w:r>
+        <w:rPr>
+          <w:rFonts w:ascii="Calibri" w:hAnsi="Calibri"/>
+          <w:b w:val="0"/>
+          <w:i w:val="0"/>
+          <w:color w:val="0F172A"/>
+          <w:sz w:val="21"/>
+        </w:rPr>
+        <w:t>5. Klik judul untuk membuka detail.</w:t>
+      </w:r>
+    </w:p>
+    <w:p>
+      <w:pPr>
+        <w:spacing w:after="80" w:line="300" w:lineRule="auto"/>
+        <w:ind w:left="540" w:hanging="360"/>
+      </w:pPr>
+      <w:r>
+        <w:rPr>
+          <w:rFonts w:ascii="Calibri" w:hAnsi="Calibri"/>
+          <w:b w:val="0"/>
+          <w:i w:val="0"/>
+          <w:color w:val="0F172A"/>
+          <w:sz w:val="21"/>
+        </w:rPr>
+        <w:t>6. Kelola checklist, komentar, mention, dan file.</w:t>
+      </w:r>
+    </w:p>
+    <w:p>
+      <w:pPr>
+        <w:pStyle w:val="Heading2"/>
+      </w:pPr>
+      <w:r>
+        <w:t>Pencarian dan laporan</w:t>
+      </w:r>
+    </w:p>
+    <w:p>
+      <w:pPr>
+        <w:spacing w:after="80" w:line="300" w:lineRule="auto"/>
+        <w:ind w:left="540" w:hanging="360"/>
+      </w:pPr>
+      <w:r>
+        <w:rPr>
+          <w:rFonts w:ascii="Calibri" w:hAnsi="Calibri"/>
+          <w:b w:val="0"/>
+          <w:i w:val="0"/>
+          <w:color w:val="0F172A"/>
+          <w:sz w:val="21"/>
+        </w:rPr>
+        <w:t>1. Gunakan pencarian pada Beranda atau header proyek.</w:t>
+      </w:r>
+    </w:p>
+    <w:p>
+      <w:pPr>
+        <w:spacing w:after="80" w:line="300" w:lineRule="auto"/>
+        <w:ind w:left="540" w:hanging="360"/>
+      </w:pPr>
+      <w:r>
+        <w:rPr>
+          <w:rFonts w:ascii="Calibri" w:hAnsi="Calibri"/>
+          <w:b w:val="0"/>
+          <w:i w:val="0"/>
+          <w:color w:val="0F172A"/>
+          <w:sz w:val="21"/>
+        </w:rPr>
+        <w:t>2. Hasil hanya menampilkan resource yang berhak diakses.</w:t>
+      </w:r>
+    </w:p>
+    <w:p>
+      <w:pPr>
+        <w:spacing w:after="80" w:line="300" w:lineRule="auto"/>
+        <w:ind w:left="540" w:hanging="360"/>
+      </w:pPr>
+      <w:r>
+        <w:rPr>
+          <w:rFonts w:ascii="Calibri" w:hAnsi="Calibri"/>
+          <w:b w:val="0"/>
+          <w:i w:val="0"/>
+          <w:color w:val="0F172A"/>
+          <w:sz w:val="21"/>
+        </w:rPr>
+        <w:t>3. Buka Laporan untuk status tugas, workload, aktivitas, dan histori notifikasi.</w:t>
+      </w:r>
+    </w:p>
+    <w:p>
+      <w:pPr>
+        <w:spacing w:after="80" w:line="300" w:lineRule="auto"/>
+        <w:ind w:left="540" w:hanging="360"/>
+      </w:pPr>
+      <w:r>
+        <w:rPr>
+          <w:rFonts w:ascii="Calibri" w:hAnsi="Calibri"/>
+          <w:b w:val="0"/>
+          <w:i w:val="0"/>
+          <w:color w:val="0F172A"/>
+          <w:sz w:val="21"/>
+        </w:rPr>
+        <w:t>4. Pilih proyek dan periode 7/30/90 hari.</w:t>
+      </w:r>
+    </w:p>
+    <w:p>
+      <w:pPr>
+        <w:spacing w:after="80" w:line="300" w:lineRule="auto"/>
+        <w:ind w:left="540" w:hanging="360"/>
+      </w:pPr>
+      <w:r>
+        <w:rPr>
+          <w:rFonts w:ascii="Calibri" w:hAnsi="Calibri"/>
+          <w:b w:val="0"/>
+          <w:i w:val="0"/>
+          <w:color w:val="0F172A"/>
+          <w:sz w:val="21"/>
+        </w:rPr>
+        <w:t>5. Unduh PDF atau Excel.</w:t>
+      </w:r>
+    </w:p>
+    <w:p>
+      <w:pPr>
+        <w:pStyle w:val="Heading2"/>
+      </w:pPr>
+      <w:r>
+        <w:t>Notifikasi WhatsApp</w:t>
+      </w:r>
+    </w:p>
+    <w:p>
+      <w:pPr>
+        <w:spacing w:after="80" w:line="300" w:lineRule="auto"/>
+        <w:ind w:left="540" w:hanging="360"/>
+      </w:pPr>
+      <w:r>
+        <w:rPr>
+          <w:rFonts w:ascii="Calibri" w:hAnsi="Calibri"/>
+          <w:b w:val="0"/>
+          <w:i w:val="0"/>
+          <w:color w:val="0F172A"/>
+          <w:sz w:val="21"/>
+        </w:rPr>
+        <w:t>1. Buka Profil lalu pilih Koneksi WhatsApp.</w:t>
+      </w:r>
+    </w:p>
+    <w:p>
+      <w:pPr>
+        <w:spacing w:after="80" w:line="300" w:lineRule="auto"/>
+        <w:ind w:left="540" w:hanging="360"/>
+      </w:pPr>
+      <w:r>
+        <w:rPr>
+          <w:rFonts w:ascii="Calibri" w:hAnsi="Calibri"/>
+          <w:b w:val="0"/>
+          <w:i w:val="0"/>
+          <w:color w:val="0F172A"/>
+          <w:sz w:val="21"/>
+        </w:rPr>
+        <w:t>2. Masukkan nomor penerima dengan kode negara, misalnya 628123456789.</w:t>
+      </w:r>
+    </w:p>
+    <w:p>
+      <w:pPr>
+        <w:spacing w:after="80" w:line="300" w:lineRule="auto"/>
+        <w:ind w:left="540" w:hanging="360"/>
+      </w:pPr>
+      <w:r>
+        <w:rPr>
+          <w:rFonts w:ascii="Calibri" w:hAnsi="Calibri"/>
+          <w:b w:val="0"/>
+          <w:i w:val="0"/>
+          <w:color w:val="0F172A"/>
+          <w:sz w:val="21"/>
+        </w:rPr>
+        <w:t>3. Pilih notifikasi tugas, perubahan tugas, chat, pengumuman, dan pengingat tenggat yang diperlukan.</w:t>
+      </w:r>
+    </w:p>
+    <w:p>
+      <w:pPr>
+        <w:spacing w:after="80" w:line="300" w:lineRule="auto"/>
+        <w:ind w:left="540" w:hanging="360"/>
+      </w:pPr>
+      <w:r>
+        <w:rPr>
+          <w:rFonts w:ascii="Calibri" w:hAnsi="Calibri"/>
+          <w:b w:val="0"/>
+          <w:i w:val="0"/>
+          <w:color w:val="0F172A"/>
+          <w:sz w:val="21"/>
+        </w:rPr>
+        <w:t>4. Atur zona waktu dan jam tenang.</w:t>
+      </w:r>
+    </w:p>
+    <w:p>
+      <w:pPr>
+        <w:spacing w:after="80" w:line="300" w:lineRule="auto"/>
+        <w:ind w:left="540" w:hanging="360"/>
+      </w:pPr>
+      <w:r>
+        <w:rPr>
+          <w:rFonts w:ascii="Calibri" w:hAnsi="Calibri"/>
+          <w:b w:val="0"/>
+          <w:i w:val="0"/>
+          <w:color w:val="0F172A"/>
+          <w:sz w:val="21"/>
+        </w:rPr>
+        <w:t>5. Centang persetujuan, aktifkan pengiriman, lalu simpan.</w:t>
+      </w:r>
+    </w:p>
+    <w:p>
+      <w:pPr>
+        <w:spacing w:after="80" w:line="300" w:lineRule="auto"/>
+        <w:ind w:left="540" w:hanging="360"/>
+      </w:pPr>
+      <w:r>
+        <w:rPr>
+          <w:rFonts w:ascii="Calibri" w:hAnsi="Calibri"/>
+          <w:b w:val="0"/>
+          <w:i w:val="0"/>
+          <w:color w:val="0F172A"/>
+          <w:sz w:val="21"/>
+        </w:rPr>
+        <w:t>6. Pilih Kirim pesan uji. Jika gagal, hubungi administrator karena API key Fonnte dikelola secara global.</w:t>
+      </w:r>
+    </w:p>
+    <w:p>
+      <w:r>
+        <w:br w:type="page"/>
+      </w:r>
+    </w:p>
+    <w:p>
+      <w:pPr>
+        <w:pStyle w:val="Heading1"/>
+      </w:pPr>
+      <w:r>
+        <w:t>Panduan Penggunaan Superadmin</w:t>
+      </w:r>
+    </w:p>
+    <w:p>
+      <w:r>
+        <w:t>Dashboard superadmin tersedia hanya untuk akun dengan global_role superadmin dan is_active bernilai true.</w:t>
+      </w:r>
+    </w:p>
+    <w:p>
+      <w:pPr>
+        <w:pStyle w:val="Heading2"/>
+      </w:pPr>
+      <w:r>
+        <w:t>Mengaktifkan superadmin pertama</w:t>
+      </w:r>
+    </w:p>
+    <w:p>
+      <w:pPr>
+        <w:spacing w:after="40"/>
+        <w:ind w:left="360"/>
+      </w:pPr>
+      <w:r>
+        <w:rPr>
+          <w:rFonts w:ascii="Consolas" w:hAnsi="Consolas"/>
+          <w:color w:val="0F172A"/>
+          <w:sz w:val="18"/>
+        </w:rPr>
+        <w:t>/opt/alt/php84/usr/bin/php artisan users:promote-superadmin email@domain.com --force</w:t>
+      </w:r>
+    </w:p>
+    <w:p>
+      <w:r>
+        <w:t>Ganti email dengan akun yang sudah terdaftar. Login ulang setelah perintah berhasil, lalu buka /admin.</w:t>
+      </w:r>
+    </w:p>
+    <w:p>
+      <w:pPr>
+        <w:pStyle w:val="Heading2"/>
+      </w:pPr>
+      <w:r>
+        <w:t>Menggunakan dashboard</w:t>
+      </w:r>
+    </w:p>
+    <w:p>
+      <w:pPr>
+        <w:spacing w:after="80" w:line="300" w:lineRule="auto"/>
+        <w:ind w:left="540" w:hanging="360"/>
+      </w:pPr>
+      <w:r>
+        <w:rPr>
+          <w:rFonts w:ascii="Calibri" w:hAnsi="Calibri"/>
+          <w:b w:val="0"/>
+          <w:i w:val="0"/>
+          <w:color w:val="0F172A"/>
+          <w:sz w:val="21"/>
+        </w:rPr>
+        <w:t>1. Gunakan tombol panah untuk memperkecil atau memperbesar sidebar desktop. Pada ponsel, tombol menu membuka drawer.</w:t>
+      </w:r>
+    </w:p>
+    <w:p>
+      <w:pPr>
+        <w:spacing w:after="80" w:line="300" w:lineRule="auto"/>
+        <w:ind w:left="540" w:hanging="360"/>
+      </w:pPr>
+      <w:r>
+        <w:rPr>
+          <w:rFonts w:ascii="Calibri" w:hAnsi="Calibri"/>
+          <w:b w:val="0"/>
+          <w:i w:val="0"/>
+          <w:color w:val="0F172A"/>
+          <w:sz w:val="21"/>
+        </w:rPr>
+        <w:t>2. Periksa statistik pengguna, pengguna aktif, superadmin, tim, proyek, dan tugas.</w:t>
+      </w:r>
+    </w:p>
+    <w:p>
+      <w:pPr>
+        <w:spacing w:after="80" w:line="300" w:lineRule="auto"/>
+        <w:ind w:left="540" w:hanging="360"/>
+      </w:pPr>
+      <w:r>
+        <w:rPr>
+          <w:rFonts w:ascii="Calibri" w:hAnsi="Calibri"/>
+          <w:b w:val="0"/>
+          <w:i w:val="0"/>
+          <w:color w:val="0F172A"/>
+          <w:sz w:val="21"/>
+        </w:rPr>
+        <w:t>3. Cari pengguna berdasarkan nama atau email. Filter hasil berdasarkan role global dan status.</w:t>
+      </w:r>
+    </w:p>
+    <w:p>
+      <w:pPr>
+        <w:spacing w:after="80" w:line="300" w:lineRule="auto"/>
+        <w:ind w:left="540" w:hanging="360"/>
+      </w:pPr>
+      <w:r>
+        <w:rPr>
+          <w:rFonts w:ascii="Calibri" w:hAnsi="Calibri"/>
+          <w:b w:val="0"/>
+          <w:i w:val="0"/>
+          <w:color w:val="0F172A"/>
+          <w:sz w:val="21"/>
+        </w:rPr>
+        <w:t>4. Pilih User atau Superadmin, tentukan status aktif, lalu pilih Simpan.</w:t>
+      </w:r>
+    </w:p>
+    <w:p>
+      <w:pPr>
+        <w:spacing w:after="80" w:line="300" w:lineRule="auto"/>
+        <w:ind w:left="540" w:hanging="360"/>
+      </w:pPr>
+      <w:r>
+        <w:rPr>
+          <w:rFonts w:ascii="Calibri" w:hAnsi="Calibri"/>
+          <w:b w:val="0"/>
+          <w:i w:val="0"/>
+          <w:color w:val="0F172A"/>
+          <w:sz w:val="21"/>
+        </w:rPr>
+        <w:t>5. Periksa Aktivitas superadmin untuk melihat actor, target, tindakan, dan waktu perubahan.</w:t>
+      </w:r>
+    </w:p>
+    <w:p>
+      <w:pPr>
+        <w:pStyle w:val="Heading2"/>
+      </w:pPr>
+      <w:r>
+        <w:t>Pengamanan akun</w:t>
+      </w:r>
+    </w:p>
+    <w:p>
+      <w:pPr>
+        <w:pStyle w:val="ListBullet"/>
         <w:spacing w:after="80" w:line="300" w:lineRule="auto"/>
       </w:pPr>
       <w:r>
@@ -3247,12 +4137,12 @@
           <w:color w:val="0F172A"/>
           <w:sz w:val="21"/>
         </w:rPr>
-        <w:t>Event aplikasi membentuk pesan notifikasi.</w:t>
+        <w:t>Akun nonaktif tidak dapat login dan sesi aktifnya dihapus.</w:t>
       </w:r>
     </w:p>
     <w:p>
       <w:pPr>
-        <w:pStyle w:val="ListNumber"/>
+        <w:pStyle w:val="ListBullet"/>
         <w:spacing w:after="80" w:line="300" w:lineRule="auto"/>
       </w:pPr>
       <w:r>
@@ -3263,12 +4153,12 @@
           <w:color w:val="0F172A"/>
           <w:sz w:val="21"/>
         </w:rPr>
-        <w:t>Preferensi dan status koneksi diperiksa.</w:t>
+        <w:t>Setiap perubahan role atau status dicatat dalam admin_audit_logs.</w:t>
       </w:r>
     </w:p>
     <w:p>
       <w:pPr>
-        <w:pStyle w:val="ListNumber"/>
+        <w:pStyle w:val="ListBullet"/>
         <w:spacing w:after="80" w:line="300" w:lineRule="auto"/>
       </w:pPr>
       <w:r>
@@ -3279,12 +4169,12 @@
           <w:color w:val="0F172A"/>
           <w:sz w:val="21"/>
         </w:rPr>
-        <w:t>Quiet hours menentukan waktu pengiriman.</w:t>
+        <w:t>Sistem menolak tindakan yang akan menghilangkan superadmin aktif terakhir.</w:t>
       </w:r>
     </w:p>
     <w:p>
       <w:pPr>
-        <w:pStyle w:val="ListNumber"/>
+        <w:pStyle w:val="ListBullet"/>
         <w:spacing w:after="80" w:line="300" w:lineRule="auto"/>
       </w:pPr>
       <w:r>
@@ -3295,39 +4185,7 @@
           <w:color w:val="0F172A"/>
           <w:sz w:val="21"/>
         </w:rPr>
-        <w:t>Log pending dibuat dengan idempotency key; job masuk queue.</w:t>
-      </w:r>
-    </w:p>
-    <w:p>
-      <w:pPr>
-        <w:pStyle w:val="ListNumber"/>
-        <w:spacing w:after="80" w:line="300" w:lineRule="auto"/>
-      </w:pPr>
-      <w:r>
-        <w:rPr>
-          <w:rFonts w:ascii="Calibri" w:hAnsi="Calibri"/>
-          <w:b w:val="0"/>
-          <w:i w:val="0"/>
-          <w:color w:val="0F172A"/>
-          <w:sz w:val="21"/>
-        </w:rPr>
-        <w:t>Job memanggil WhatsApp Cloud API dan mencatat sent, failed, atau skipped.</w:t>
-      </w:r>
-    </w:p>
-    <w:p>
-      <w:pPr>
-        <w:pStyle w:val="ListNumber"/>
-        <w:spacing w:after="80" w:line="300" w:lineRule="auto"/>
-      </w:pPr>
-      <w:r>
-        <w:rPr>
-          <w:rFonts w:ascii="Calibri" w:hAnsi="Calibri"/>
-          <w:b w:val="0"/>
-          <w:i w:val="0"/>
-          <w:color w:val="0F172A"/>
-          <w:sz w:val="21"/>
-        </w:rPr>
-        <w:t>Email undangan dikirim via SMTP dan dicatat di email_notification_logs.</w:t>
+        <w:t>Gunakan akun superadmin hanya untuk administrasi platform. Gunakan role tim untuk pekerjaan proyek sehari-hari.</w:t>
       </w:r>
     </w:p>
     <w:p>
@@ -3335,295 +4193,7 @@
         <w:pStyle w:val="Heading1"/>
       </w:pPr>
       <w:r>
-        <w:t>6. Panduan Penggunaan</w:t>
-      </w:r>
-    </w:p>
-    <w:p>
-      <w:pPr>
-        <w:pStyle w:val="Heading2"/>
-      </w:pPr>
-      <w:r>
-        <w:t>A. Memulai</w:t>
-      </w:r>
-    </w:p>
-    <w:p>
-      <w:pPr>
-        <w:pStyle w:val="ListNumber"/>
-        <w:spacing w:after="80" w:line="300" w:lineRule="auto"/>
-      </w:pPr>
-      <w:r>
-        <w:rPr>
-          <w:rFonts w:ascii="Calibri" w:hAnsi="Calibri"/>
-          <w:b w:val="0"/>
-          <w:i w:val="0"/>
-          <w:color w:val="0F172A"/>
-          <w:sz w:val="21"/>
-        </w:rPr>
-        <w:t>Registrasi lalu login.</w:t>
-      </w:r>
-    </w:p>
-    <w:p>
-      <w:pPr>
-        <w:pStyle w:val="ListNumber"/>
-        <w:spacing w:after="80" w:line="300" w:lineRule="auto"/>
-      </w:pPr>
-      <w:r>
-        <w:rPr>
-          <w:rFonts w:ascii="Calibri" w:hAnsi="Calibri"/>
-          <w:b w:val="0"/>
-          <w:i w:val="0"/>
-          <w:color w:val="0F172A"/>
-          <w:sz w:val="21"/>
-        </w:rPr>
-        <w:t>Lengkapi profil, jabatan, telepon, bio, avatar, dan kata sandi.</w:t>
-      </w:r>
-    </w:p>
-    <w:p>
-      <w:pPr>
-        <w:pStyle w:val="ListNumber"/>
-        <w:spacing w:after="80" w:line="300" w:lineRule="auto"/>
-      </w:pPr>
-      <w:r>
-        <w:rPr>
-          <w:rFonts w:ascii="Calibri" w:hAnsi="Calibri"/>
-          <w:b w:val="0"/>
-          <w:i w:val="0"/>
-          <w:color w:val="0F172A"/>
-          <w:sz w:val="21"/>
-        </w:rPr>
-        <w:t>Buat tim; pembuat otomatis menjadi Owner.</w:t>
-      </w:r>
-    </w:p>
-    <w:p>
-      <w:pPr>
-        <w:pStyle w:val="ListNumber"/>
-        <w:spacing w:after="80" w:line="300" w:lineRule="auto"/>
-      </w:pPr>
-      <w:r>
-        <w:rPr>
-          <w:rFonts w:ascii="Calibri" w:hAnsi="Calibri"/>
-          <w:b w:val="0"/>
-          <w:i w:val="0"/>
-          <w:color w:val="0F172A"/>
-          <w:sz w:val="21"/>
-        </w:rPr>
-        <w:t>Undang anggota lewat Gmail atau tambahkan akun terdaftar.</w:t>
-      </w:r>
-    </w:p>
-    <w:p>
-      <w:pPr>
-        <w:pStyle w:val="ListNumber"/>
-        <w:spacing w:after="80" w:line="300" w:lineRule="auto"/>
-      </w:pPr>
-      <w:r>
-        <w:rPr>
-          <w:rFonts w:ascii="Calibri" w:hAnsi="Calibri"/>
-          <w:b w:val="0"/>
-          <w:i w:val="0"/>
-          <w:color w:val="0F172A"/>
-          <w:sz w:val="21"/>
-        </w:rPr>
-        <w:t>Buat proyek pada tim yang dikelola.</w:t>
-      </w:r>
-    </w:p>
-    <w:p>
-      <w:pPr>
-        <w:pStyle w:val="Heading2"/>
-      </w:pPr>
-      <w:r>
-        <w:t>B. Kanban dan tugas</w:t>
-      </w:r>
-    </w:p>
-    <w:p>
-      <w:pPr>
-        <w:pStyle w:val="ListNumber"/>
-        <w:spacing w:after="80" w:line="300" w:lineRule="auto"/>
-      </w:pPr>
-      <w:r>
-        <w:rPr>
-          <w:rFonts w:ascii="Calibri" w:hAnsi="Calibri"/>
-          <w:b w:val="0"/>
-          <w:i w:val="0"/>
-          <w:color w:val="0F172A"/>
-          <w:sz w:val="21"/>
-        </w:rPr>
-        <w:t>Buka proyek dan pilih Buat tugas.</w:t>
-      </w:r>
-    </w:p>
-    <w:p>
-      <w:pPr>
-        <w:pStyle w:val="ListNumber"/>
-        <w:spacing w:after="80" w:line="300" w:lineRule="auto"/>
-      </w:pPr>
-      <w:r>
-        <w:rPr>
-          <w:rFonts w:ascii="Calibri" w:hAnsi="Calibri"/>
-          <w:b w:val="0"/>
-          <w:i w:val="0"/>
-          <w:color w:val="0F172A"/>
-          <w:sz w:val="21"/>
-        </w:rPr>
-        <w:t>Pilih satu atau beberapa penanggung jawab.</w:t>
-      </w:r>
-    </w:p>
-    <w:p>
-      <w:pPr>
-        <w:pStyle w:val="ListNumber"/>
-        <w:spacing w:after="80" w:line="300" w:lineRule="auto"/>
-      </w:pPr>
-      <w:r>
-        <w:rPr>
-          <w:rFonts w:ascii="Calibri" w:hAnsi="Calibri"/>
-          <w:b w:val="0"/>
-          <w:i w:val="0"/>
-          <w:color w:val="0F172A"/>
-          <w:sz w:val="21"/>
-        </w:rPr>
-        <w:t>Gunakan filter teks, anggota, prioritas, dan tenggat.</w:t>
-      </w:r>
-    </w:p>
-    <w:p>
-      <w:pPr>
-        <w:pStyle w:val="ListNumber"/>
-        <w:spacing w:after="80" w:line="300" w:lineRule="auto"/>
-      </w:pPr>
-      <w:r>
-        <w:rPr>
-          <w:rFonts w:ascii="Calibri" w:hAnsi="Calibri"/>
-          <w:b w:val="0"/>
-          <w:i w:val="0"/>
-          <w:color w:val="0F172A"/>
-          <w:sz w:val="21"/>
-        </w:rPr>
-        <w:t>Seret kartu untuk memperbarui status.</w:t>
-      </w:r>
-    </w:p>
-    <w:p>
-      <w:pPr>
-        <w:pStyle w:val="ListNumber"/>
-        <w:spacing w:after="80" w:line="300" w:lineRule="auto"/>
-      </w:pPr>
-      <w:r>
-        <w:rPr>
-          <w:rFonts w:ascii="Calibri" w:hAnsi="Calibri"/>
-          <w:b w:val="0"/>
-          <w:i w:val="0"/>
-          <w:color w:val="0F172A"/>
-          <w:sz w:val="21"/>
-        </w:rPr>
-        <w:t>Klik judul untuk membuka detail.</w:t>
-      </w:r>
-    </w:p>
-    <w:p>
-      <w:pPr>
-        <w:pStyle w:val="ListNumber"/>
-        <w:spacing w:after="80" w:line="300" w:lineRule="auto"/>
-      </w:pPr>
-      <w:r>
-        <w:rPr>
-          <w:rFonts w:ascii="Calibri" w:hAnsi="Calibri"/>
-          <w:b w:val="0"/>
-          <w:i w:val="0"/>
-          <w:color w:val="0F172A"/>
-          <w:sz w:val="21"/>
-        </w:rPr>
-        <w:t>Kelola checklist, komentar, mention, dan file.</w:t>
-      </w:r>
-    </w:p>
-    <w:p>
-      <w:pPr>
-        <w:pStyle w:val="Heading2"/>
-      </w:pPr>
-      <w:r>
-        <w:t>C. Pencarian dan laporan</w:t>
-      </w:r>
-    </w:p>
-    <w:p>
-      <w:pPr>
-        <w:pStyle w:val="ListNumber"/>
-        <w:spacing w:after="80" w:line="300" w:lineRule="auto"/>
-      </w:pPr>
-      <w:r>
-        <w:rPr>
-          <w:rFonts w:ascii="Calibri" w:hAnsi="Calibri"/>
-          <w:b w:val="0"/>
-          <w:i w:val="0"/>
-          <w:color w:val="0F172A"/>
-          <w:sz w:val="21"/>
-        </w:rPr>
-        <w:t>Gunakan pencarian pada Beranda atau header proyek.</w:t>
-      </w:r>
-    </w:p>
-    <w:p>
-      <w:pPr>
-        <w:pStyle w:val="ListNumber"/>
-        <w:spacing w:after="80" w:line="300" w:lineRule="auto"/>
-      </w:pPr>
-      <w:r>
-        <w:rPr>
-          <w:rFonts w:ascii="Calibri" w:hAnsi="Calibri"/>
-          <w:b w:val="0"/>
-          <w:i w:val="0"/>
-          <w:color w:val="0F172A"/>
-          <w:sz w:val="21"/>
-        </w:rPr>
-        <w:t>Hasil hanya menampilkan resource yang berhak diakses.</w:t>
-      </w:r>
-    </w:p>
-    <w:p>
-      <w:pPr>
-        <w:pStyle w:val="ListNumber"/>
-        <w:spacing w:after="80" w:line="300" w:lineRule="auto"/>
-      </w:pPr>
-      <w:r>
-        <w:rPr>
-          <w:rFonts w:ascii="Calibri" w:hAnsi="Calibri"/>
-          <w:b w:val="0"/>
-          <w:i w:val="0"/>
-          <w:color w:val="0F172A"/>
-          <w:sz w:val="21"/>
-        </w:rPr>
-        <w:t>Buka Laporan untuk status tugas, workload, aktivitas, dan histori notifikasi.</w:t>
-      </w:r>
-    </w:p>
-    <w:p>
-      <w:pPr>
-        <w:pStyle w:val="ListNumber"/>
-        <w:spacing w:after="80" w:line="300" w:lineRule="auto"/>
-      </w:pPr>
-      <w:r>
-        <w:rPr>
-          <w:rFonts w:ascii="Calibri" w:hAnsi="Calibri"/>
-          <w:b w:val="0"/>
-          <w:i w:val="0"/>
-          <w:color w:val="0F172A"/>
-          <w:sz w:val="21"/>
-        </w:rPr>
-        <w:t>Pilih proyek dan periode 7/30/90 hari.</w:t>
-      </w:r>
-    </w:p>
-    <w:p>
-      <w:pPr>
-        <w:pStyle w:val="ListNumber"/>
-        <w:spacing w:after="80" w:line="300" w:lineRule="auto"/>
-      </w:pPr>
-      <w:r>
-        <w:rPr>
-          <w:rFonts w:ascii="Calibri" w:hAnsi="Calibri"/>
-          <w:b w:val="0"/>
-          <w:i w:val="0"/>
-          <w:color w:val="0F172A"/>
-          <w:sz w:val="21"/>
-        </w:rPr>
-        <w:t>Unduh PDF atau Excel.</w:t>
-      </w:r>
-    </w:p>
-    <w:p>
-      <w:pPr>
-        <w:pStyle w:val="Heading1"/>
-      </w:pPr>
-      <w:r>
-        <w:t>7. File dan Keamanan Upload</w:t>
+        <w:t>File dan Keamanan Upload</w:t>
       </w:r>
     </w:p>
     <w:tbl>
@@ -3640,6 +4210,9 @@
         <w:gridCol w:w="7060"/>
       </w:tblGrid>
       <w:tr>
+        <w:trPr>
+          <w:tblHeader w:val="true"/>
+        </w:trPr>
         <w:tc>
           <w:tcPr>
             <w:tcW w:type="dxa" w:w="2300"/>
@@ -3678,9 +4251,6 @@
             </w:r>
           </w:p>
         </w:tc>
-        <w:trPr>
-          <w:tblHeader/>
-        </w:trPr>
       </w:tr>
       <w:tr>
         <w:tc>
@@ -4036,7 +4606,7 @@
         <w:pStyle w:val="Heading1"/>
       </w:pPr>
       <w:r>
-        <w:t>8. Integrasi Gmail dan WhatsApp</w:t>
+        <w:t>Integrasi Gmail dan Fonnte</w:t>
       </w:r>
     </w:p>
     <w:p>
@@ -4061,6 +4631,9 @@
         <w:gridCol w:w="6360"/>
       </w:tblGrid>
       <w:tr>
+        <w:trPr>
+          <w:tblHeader w:val="true"/>
+        </w:trPr>
         <w:tc>
           <w:tcPr>
             <w:tcW w:type="dxa" w:w="3000"/>
@@ -4099,9 +4672,6 @@
             </w:r>
           </w:p>
         </w:tc>
-        <w:trPr>
-          <w:tblHeader/>
-        </w:trPr>
       </w:tr>
       <w:tr>
         <w:tc>
@@ -4119,6 +4689,44 @@
                 <w:sz w:val="18"/>
               </w:rPr>
               <w:t>MAIL_MAILER</w:t>
+            </w:r>
+          </w:p>
+        </w:tc>
+        <w:tc>
+          <w:tcPr>
+            <w:tcW w:type="dxa" w:w="6360"/>
+            <w:vAlign w:val="center"/>
+          </w:tcPr>
+          <w:p>
+            <w:r>
+              <w:rPr>
+                <w:rFonts w:ascii="Calibri" w:hAnsi="Calibri"/>
+                <w:b w:val="0"/>
+                <w:i w:val="0"/>
+                <w:color w:val="0F172A"/>
+                <w:sz w:val="18"/>
+              </w:rPr>
+              <w:t>smtp</w:t>
+            </w:r>
+          </w:p>
+        </w:tc>
+      </w:tr>
+      <w:tr>
+        <w:tc>
+          <w:tcPr>
+            <w:tcW w:type="dxa" w:w="3000"/>
+            <w:vAlign w:val="center"/>
+          </w:tcPr>
+          <w:p>
+            <w:r>
+              <w:rPr>
+                <w:rFonts w:ascii="Calibri" w:hAnsi="Calibri"/>
+                <w:b w:val="0"/>
+                <w:i w:val="0"/>
+                <w:color w:val="0F172A"/>
+                <w:sz w:val="18"/>
+              </w:rPr>
+              <w:t>MAIL_SCHEME</w:t>
             </w:r>
           </w:p>
         </w:tc>
@@ -4232,44 +4840,6 @@
                 <w:color w:val="0F172A"/>
                 <w:sz w:val="18"/>
               </w:rPr>
-              <w:t>MAIL_ENCRYPTION</w:t>
-            </w:r>
-          </w:p>
-        </w:tc>
-        <w:tc>
-          <w:tcPr>
-            <w:tcW w:type="dxa" w:w="6360"/>
-            <w:vAlign w:val="center"/>
-          </w:tcPr>
-          <w:p>
-            <w:r>
-              <w:rPr>
-                <w:rFonts w:ascii="Calibri" w:hAnsi="Calibri"/>
-                <w:b w:val="0"/>
-                <w:i w:val="0"/>
-                <w:color w:val="0F172A"/>
-                <w:sz w:val="18"/>
-              </w:rPr>
-              <w:t>tls</w:t>
-            </w:r>
-          </w:p>
-        </w:tc>
-      </w:tr>
-      <w:tr>
-        <w:tc>
-          <w:tcPr>
-            <w:tcW w:type="dxa" w:w="3000"/>
-            <w:vAlign w:val="center"/>
-          </w:tcPr>
-          <w:p>
-            <w:r>
-              <w:rPr>
-                <w:rFonts w:ascii="Calibri" w:hAnsi="Calibri"/>
-                <w:b w:val="0"/>
-                <w:i w:val="0"/>
-                <w:color w:val="0F172A"/>
-                <w:sz w:val="18"/>
-              </w:rPr>
               <w:t>MAIL_USERNAME</w:t>
             </w:r>
           </w:p>
@@ -4326,7 +4896,7 @@
                 <w:color w:val="0F172A"/>
                 <w:sz w:val="18"/>
               </w:rPr>
-              <w:t>Google App Password</w:t>
+              <w:t>Google App Password tanpa spasi</w:t>
             </w:r>
           </w:p>
         </w:tc>
@@ -4373,7 +4943,7 @@
     <w:p/>
     <w:p>
       <w:r>
-        <w:t>Aktifkan Verifikasi 2 Langkah, buat Google App Password, isi .env, lalu jalankan php artisan config:clear. Jangan commit kredensial.</w:t>
+        <w:t>Aktifkan Verifikasi 2 Langkah, buat Google App Password, isi .env, lalu bersihkan cache konfigurasi. Jangan commit kredensial atau menampilkannya pada tangkapan layar.</w:t>
       </w:r>
     </w:p>
     <w:p>
@@ -4381,7 +4951,7 @@
         <w:pStyle w:val="Heading2"/>
       </w:pPr>
       <w:r>
-        <w:t>WhatsApp Cloud API</w:t>
+        <w:t>Fonnte Send API</w:t>
       </w:r>
     </w:p>
     <w:p>
@@ -4397,7 +4967,23 @@
           <w:color w:val="0F172A"/>
           <w:sz w:val="21"/>
         </w:rPr>
-        <w:t>Setiap pengguna menyimpan Phone Number ID, access token terenkripsi, nomor penerima, template, bahasa, dan preferensi event.</w:t>
+        <w:t>Administrator menyimpan satu token perangkat pada FONNTE_API_KEY di .env. Token tidak dimasukkan oleh user dan tidak disimpan pada whatsapp_connections.</w:t>
+      </w:r>
+    </w:p>
+    <w:p>
+      <w:pPr>
+        <w:pStyle w:val="ListBullet"/>
+        <w:spacing w:after="80" w:line="300" w:lineRule="auto"/>
+      </w:pPr>
+      <w:r>
+        <w:rPr>
+          <w:rFonts w:ascii="Calibri" w:hAnsi="Calibri"/>
+          <w:b w:val="0"/>
+          <w:i w:val="0"/>
+          <w:color w:val="0F172A"/>
+          <w:sz w:val="21"/>
+        </w:rPr>
+        <w:t>Setiap user menyimpan nomor penerima, persetujuan, preferensi event, timezone, dan jam tenang.</w:t>
       </w:r>
     </w:p>
     <w:p>
@@ -4469,7 +5055,7 @@
         <w:pStyle w:val="Heading1"/>
       </w:pPr>
       <w:r>
-        <w:t>9. Dashboard dan Laporan</w:t>
+        <w:t>Dashboard dan Laporan</w:t>
       </w:r>
     </w:p>
     <w:p>
@@ -4562,7 +5148,7 @@
         <w:pStyle w:val="Heading1"/>
       </w:pPr>
       <w:r>
-        <w:t>10. Konfigurasi, Operasi, dan Pengujian</w:t>
+        <w:t>Deployment dan Operasi</w:t>
       </w:r>
     </w:p>
     <w:p>
@@ -4570,12 +5156,12 @@
         <w:pStyle w:val="Heading2"/>
       </w:pPr>
       <w:r>
-        <w:t>Instalasi dan pembaruan</w:t>
+        <w:t>Persyaratan produksi</w:t>
       </w:r>
     </w:p>
     <w:p>
       <w:pPr>
-        <w:pStyle w:val="ListNumber"/>
+        <w:pStyle w:val="ListBullet"/>
         <w:spacing w:after="80" w:line="300" w:lineRule="auto"/>
       </w:pPr>
       <w:r>
@@ -4586,12 +5172,12 @@
           <w:color w:val="0F172A"/>
           <w:sz w:val="21"/>
         </w:rPr>
-        <w:t>Salin .env.example menjadi .env dan isi database serta integrasi.</w:t>
+        <w:t>PHP minimal 8.4.1. Pada hosting saat ini gunakan /opt/alt/php84/usr/bin/php.</w:t>
       </w:r>
     </w:p>
     <w:p>
       <w:pPr>
-        <w:pStyle w:val="ListNumber"/>
+        <w:pStyle w:val="ListBullet"/>
         <w:spacing w:after="80" w:line="300" w:lineRule="auto"/>
       </w:pPr>
       <w:r>
@@ -4602,12 +5188,12 @@
           <w:color w:val="0F172A"/>
           <w:sz w:val="21"/>
         </w:rPr>
-        <w:t>Jalankan composer install dan npm install.</w:t>
+        <w:t>Document root mengarah ke public atau aplikasi menyediakan public/index.php sesuai konfigurasi hosting.</w:t>
       </w:r>
     </w:p>
     <w:p>
       <w:pPr>
-        <w:pStyle w:val="ListNumber"/>
+        <w:pStyle w:val="ListBullet"/>
         <w:spacing w:after="80" w:line="300" w:lineRule="auto"/>
       </w:pPr>
       <w:r>
@@ -4618,12 +5204,12 @@
           <w:color w:val="0F172A"/>
           <w:sz w:val="21"/>
         </w:rPr>
-        <w:t>Jalankan php artisan key:generate.</w:t>
+        <w:t>Direktori storage dan bootstrap/cache dapat ditulis oleh user web hosting.</w:t>
       </w:r>
     </w:p>
     <w:p>
       <w:pPr>
-        <w:pStyle w:val="ListNumber"/>
+        <w:pStyle w:val="ListBullet"/>
         <w:spacing w:after="80" w:line="300" w:lineRule="auto"/>
       </w:pPr>
       <w:r>
@@ -4634,12 +5220,12 @@
           <w:color w:val="0F172A"/>
           <w:sz w:val="21"/>
         </w:rPr>
-        <w:t>Jalankan php artisan migrate --seed bila diperlukan.</w:t>
+        <w:t>APP_ENV=production, APP_DEBUG=false, APP_URL memakai domain HTTPS, serta APP_KEY tetap dan tidak diganti setelah produksi.</w:t>
       </w:r>
     </w:p>
     <w:p>
       <w:pPr>
-        <w:pStyle w:val="ListNumber"/>
+        <w:pStyle w:val="ListBullet"/>
         <w:spacing w:after="80" w:line="300" w:lineRule="auto"/>
       </w:pPr>
       <w:r>
@@ -4650,23 +5236,191 @@
           <w:color w:val="0F172A"/>
           <w:sz w:val="21"/>
         </w:rPr>
-        <w:t>Jalankan npm run build.</w:t>
+        <w:t>QUEUE_CONNECTION=database, database sudah dibuat, dan public/storage terhubung ke storage/app/public.</w:t>
       </w:r>
     </w:p>
     <w:p>
       <w:pPr>
-        <w:pStyle w:val="ListNumber"/>
-        <w:spacing w:after="80" w:line="300" w:lineRule="auto"/>
+        <w:pStyle w:val="Heading2"/>
+      </w:pPr>
+      <w:r>
+        <w:t>Pembaruan aplikasi</w:t>
+      </w:r>
+    </w:p>
+    <w:p>
+      <w:pPr>
+        <w:spacing w:after="40"/>
+        <w:ind w:left="360"/>
       </w:pPr>
       <w:r>
         <w:rPr>
-          <w:rFonts w:ascii="Calibri" w:hAnsi="Calibri"/>
-          <w:b w:val="0"/>
-          <w:i w:val="0"/>
+          <w:rFonts w:ascii="Consolas" w:hAnsi="Consolas"/>
           <w:color w:val="0F172A"/>
-          <w:sz w:val="21"/>
+          <w:sz w:val="18"/>
         </w:rPr>
-        <w:t>Aktifkan php artisan queue:listen dan scheduler di server.</w:t>
+        <w:t>cd /home/u930607946/domains/ruangkerja.sivmi.id/public_html</w:t>
+      </w:r>
+    </w:p>
+    <w:p>
+      <w:pPr>
+        <w:spacing w:after="40"/>
+        <w:ind w:left="360"/>
+      </w:pPr>
+      <w:r>
+        <w:rPr>
+          <w:rFonts w:ascii="Consolas" w:hAnsi="Consolas"/>
+          <w:color w:val="0F172A"/>
+          <w:sz w:val="18"/>
+        </w:rPr>
+        <w:t>git pull origin main</w:t>
+      </w:r>
+    </w:p>
+    <w:p>
+      <w:pPr>
+        <w:spacing w:after="40"/>
+        <w:ind w:left="360"/>
+      </w:pPr>
+      <w:r>
+        <w:rPr>
+          <w:rFonts w:ascii="Consolas" w:hAnsi="Consolas"/>
+          <w:color w:val="0F172A"/>
+          <w:sz w:val="18"/>
+        </w:rPr>
+        <w:t>/opt/alt/php84/usr/bin/php artisan optimize:clear</w:t>
+      </w:r>
+    </w:p>
+    <w:p>
+      <w:pPr>
+        <w:spacing w:after="40"/>
+        <w:ind w:left="360"/>
+      </w:pPr>
+      <w:r>
+        <w:rPr>
+          <w:rFonts w:ascii="Consolas" w:hAnsi="Consolas"/>
+          <w:color w:val="0F172A"/>
+          <w:sz w:val="18"/>
+        </w:rPr>
+        <w:t>/opt/alt/php84/usr/bin/php artisan migrate --force</w:t>
+      </w:r>
+    </w:p>
+    <w:p>
+      <w:pPr>
+        <w:spacing w:after="40"/>
+        <w:ind w:left="360"/>
+      </w:pPr>
+      <w:r>
+        <w:rPr>
+          <w:rFonts w:ascii="Consolas" w:hAnsi="Consolas"/>
+          <w:color w:val="0F172A"/>
+          <w:sz w:val="18"/>
+        </w:rPr>
+        <w:t>/opt/alt/php84/usr/bin/php artisan storage:link</w:t>
+      </w:r>
+    </w:p>
+    <w:p>
+      <w:pPr>
+        <w:spacing w:after="40"/>
+        <w:ind w:left="360"/>
+      </w:pPr>
+      <w:r>
+        <w:rPr>
+          <w:rFonts w:ascii="Consolas" w:hAnsi="Consolas"/>
+          <w:color w:val="0F172A"/>
+          <w:sz w:val="18"/>
+        </w:rPr>
+        <w:t>/opt/alt/php84/usr/bin/php artisan optimize</w:t>
+      </w:r>
+    </w:p>
+    <w:p>
+      <w:r>
+        <w:t>Jika server tidak memiliki npm, jalankan npm run build di komputer pengembang lalu unggah folder public/build. Pastikan manifest.json dan assets berada langsung di public/build, bukan public/build/build.</w:t>
+      </w:r>
+    </w:p>
+    <w:p>
+      <w:pPr>
+        <w:pStyle w:val="Heading2"/>
+      </w:pPr>
+      <w:r>
+        <w:t>Konfigurasi Fonnte global</w:t>
+      </w:r>
+    </w:p>
+    <w:p>
+      <w:pPr>
+        <w:spacing w:after="40"/>
+        <w:ind w:left="360"/>
+      </w:pPr>
+      <w:r>
+        <w:rPr>
+          <w:rFonts w:ascii="Consolas" w:hAnsi="Consolas"/>
+          <w:color w:val="0F172A"/>
+          <w:sz w:val="18"/>
+        </w:rPr>
+        <w:t>FONNTE_API_KEY=token_perangkat_fonnte</w:t>
+      </w:r>
+    </w:p>
+    <w:p>
+      <w:pPr>
+        <w:spacing w:after="40"/>
+        <w:ind w:left="360"/>
+      </w:pPr>
+      <w:r>
+        <w:rPr>
+          <w:rFonts w:ascii="Consolas" w:hAnsi="Consolas"/>
+          <w:color w:val="0F172A"/>
+          <w:sz w:val="18"/>
+        </w:rPr>
+        <w:t>FONNTE_API_URL=https://api.fonnte.com/send</w:t>
+      </w:r>
+    </w:p>
+    <w:p>
+      <w:r>
+        <w:t>Setelah .env diubah, jalankan optimize:clear lalu optimize. Verifikasi konfigurasi tanpa mencetak token dengan perintah tinker yang memeriksa apakah nilai services.fonnte.api_key terisi.</w:t>
+      </w:r>
+    </w:p>
+    <w:p>
+      <w:pPr>
+        <w:pStyle w:val="Heading2"/>
+      </w:pPr>
+      <w:r>
+        <w:t>Queue dan scheduler</w:t>
+      </w:r>
+    </w:p>
+    <w:p>
+      <w:r>
+        <w:t>Buat dua cron job terpisah dengan jadwal setiap menit. Gunakan path PHP 8.4 agar Composer tidak dijalankan oleh PHP 8.3.</w:t>
+      </w:r>
+    </w:p>
+    <w:p>
+      <w:pPr>
+        <w:spacing w:after="40"/>
+        <w:ind w:left="360"/>
+      </w:pPr>
+      <w:r>
+        <w:rPr>
+          <w:rFonts w:ascii="Consolas" w:hAnsi="Consolas"/>
+          <w:color w:val="0F172A"/>
+          <w:sz w:val="18"/>
+        </w:rPr>
+        <w:t>/opt/alt/php84/usr/bin/php /home/u930607946/domains/ruangkerja.sivmi.id/public_html/artisan queue:work database --stop-when-empty --sleep=1 --tries=3 --timeout=60</w:t>
+      </w:r>
+    </w:p>
+    <w:p>
+      <w:pPr>
+        <w:spacing w:after="40"/>
+        <w:ind w:left="360"/>
+      </w:pPr>
+      <w:r>
+        <w:rPr>
+          <w:rFonts w:ascii="Consolas" w:hAnsi="Consolas"/>
+          <w:color w:val="0F172A"/>
+          <w:sz w:val="18"/>
+        </w:rPr>
+        <w:t>/opt/alt/php84/usr/bin/php /home/u930607946/domains/ruangkerja.sivmi.id/public_html/artisan schedule:run</w:t>
+      </w:r>
+    </w:p>
+    <w:p>
+      <w:r>
+        <w:t>Pada panel hosting yang tidak menyediakan daemon, pola stop-when-empty cocok dijalankan setiap menit. Log cron dapat diarahkan ke storage/logs bila panel mendukung output.</w:t>
       </w:r>
     </w:p>
     <w:p>
@@ -4691,6 +5445,9 @@
         <w:gridCol w:w="5760"/>
       </w:tblGrid>
       <w:tr>
+        <w:trPr>
+          <w:tblHeader w:val="true"/>
+        </w:trPr>
         <w:tc>
           <w:tcPr>
             <w:tcW w:type="dxa" w:w="3600"/>
@@ -4729,9 +5486,6 @@
             </w:r>
           </w:p>
         </w:tc>
-        <w:trPr>
-          <w:tblHeader/>
-        </w:trPr>
       </w:tr>
       <w:tr>
         <w:tc>
@@ -4977,7 +5731,7 @@
     </w:p>
     <w:p>
       <w:r>
-        <w:t>Status saat dokumentasi dibuat: 92 test lulus dengan 358 assertions; migration berstatus Ran; Blade dan build frontend berhasil.</w:t>
+        <w:t>Status saat dokumentasi dibuat: 107 test lulus dengan 425 assertions; Blade cache dan build frontend berhasil.</w:t>
       </w:r>
     </w:p>
     <w:p>
@@ -4985,7 +5739,7 @@
         <w:pStyle w:val="Heading1"/>
       </w:pPr>
       <w:r>
-        <w:t>11. Indeks Diagram Draw.io</w:t>
+        <w:t>Indeks Diagram Draw.io</w:t>
       </w:r>
     </w:p>
     <w:tbl>
@@ -5002,6 +5756,9 @@
         <w:gridCol w:w="6660"/>
       </w:tblGrid>
       <w:tr>
+        <w:trPr>
+          <w:tblHeader w:val="true"/>
+        </w:trPr>
         <w:tc>
           <w:tcPr>
             <w:tcW w:type="dxa" w:w="2700"/>
@@ -5040,9 +5797,6 @@
             </w:r>
           </w:p>
         </w:tc>
-        <w:trPr>
-          <w:tblHeader/>
-        </w:trPr>
       </w:tr>
       <w:tr>
         <w:tc>
@@ -5077,7 +5831,7 @@
                 <w:color w:val="0F172A"/>
                 <w:sz w:val="18"/>
               </w:rPr>
-              <w:t>Navigasi publik, workspace, tim, proyek, tugas, file, laporan.</w:t>
+              <w:t>Navigasi publik, workspace, tim, proyek, tugas, file, laporan, dan superadmin.</w:t>
             </w:r>
           </w:p>
         </w:tc>
@@ -5115,7 +5869,7 @@
                 <w:color w:val="0F172A"/>
                 <w:sz w:val="18"/>
               </w:rPr>
-              <w:t>User, Team, membership, invitation, Board, List, Task.</w:t>
+              <w:t>User, akses global, admin audit, Team, membership, Board, List, dan Task.</w:t>
             </w:r>
           </w:p>
         </w:tc>
@@ -5153,7 +5907,7 @@
                 <w:color w:val="0F172A"/>
                 <w:sz w:val="18"/>
               </w:rPr>
-              <w:t>Assignee, checklist, comment, mention, activity, attachment, notifikasi.</w:t>
+              <w:t>Assignee, checklist, comment, mention, activity, attachment, dan notifikasi.</w:t>
             </w:r>
           </w:p>
         </w:tc>
@@ -5191,7 +5945,7 @@
                 <w:color w:val="0F172A"/>
                 <w:sz w:val="18"/>
               </w:rPr>
-              <w:t>Owner/Admin/Member dan aturan resource.</w:t>
+              <w:t>Superadmin global serta Owner, Admin, dan Member pada tim.</w:t>
             </w:r>
           </w:p>
         </w:tc>
@@ -5267,7 +6021,7 @@
                 <w:color w:val="0F172A"/>
                 <w:sz w:val="18"/>
               </w:rPr>
-              <w:t>Create/update task dan kolaborasi.</w:t>
+              <w:t>Pembuatan dan pembaruan tugas serta kolaborasi.</w:t>
             </w:r>
           </w:p>
         </w:tc>
@@ -5305,7 +6059,7 @@
                 <w:color w:val="0F172A"/>
                 <w:sz w:val="18"/>
               </w:rPr>
-              <w:t>Validasi, antivirus, storage, preview, versioning, permission.</w:t>
+              <w:t>Validasi, antivirus, storage, preview, versioning, dan permission.</w:t>
             </w:r>
           </w:p>
         </w:tc>
@@ -5343,7 +6097,7 @@
                 <w:color w:val="0F172A"/>
                 <w:sz w:val="18"/>
               </w:rPr>
-              <w:t>Gmail, WhatsApp queue/log, dashboard, ekspor.</w:t>
+              <w:t>Gmail, Fonnte global, queue, log, dashboard, dan ekspor.</w:t>
             </w:r>
           </w:p>
         </w:tc>
@@ -5381,7 +6135,7 @@
                 <w:color w:val="0F172A"/>
                 <w:sz w:val="18"/>
               </w:rPr>
-              <w:t>Langkah penggunaan end-to-end.</w:t>
+              <w:t>Langkah penggunaan user dari registrasi sampai laporan.</w:t>
             </w:r>
           </w:p>
         </w:tc>
@@ -5419,7 +6173,45 @@
                 <w:color w:val="0F172A"/>
                 <w:sz w:val="18"/>
               </w:rPr>
-              <w:t>Runtime, .env, queue, scheduler, storage, quality gate.</w:t>
+              <w:t>PHP 8.4, .env, queue, scheduler, storage, dan quality gate.</w:t>
+            </w:r>
+          </w:p>
+        </w:tc>
+      </w:tr>
+      <w:tr>
+        <w:tc>
+          <w:tcPr>
+            <w:tcW w:type="dxa" w:w="2700"/>
+            <w:vAlign w:val="center"/>
+          </w:tcPr>
+          <w:p>
+            <w:r>
+              <w:rPr>
+                <w:rFonts w:ascii="Calibri" w:hAnsi="Calibri"/>
+                <w:b w:val="0"/>
+                <w:i w:val="0"/>
+                <w:color w:val="0F172A"/>
+                <w:sz w:val="18"/>
+              </w:rPr>
+              <w:t>11 - Superadmin Guide</w:t>
+            </w:r>
+          </w:p>
+        </w:tc>
+        <w:tc>
+          <w:tcPr>
+            <w:tcW w:type="dxa" w:w="6660"/>
+            <w:vAlign w:val="center"/>
+          </w:tcPr>
+          <w:p>
+            <w:r>
+              <w:rPr>
+                <w:rFonts w:ascii="Calibri" w:hAnsi="Calibri"/>
+                <w:b w:val="0"/>
+                <w:i w:val="0"/>
+                <w:color w:val="0F172A"/>
+                <w:sz w:val="18"/>
+              </w:rPr>
+              <w:t>Promosi akun, dashboard, pengelolaan user, dan audit.</w:t>
             </w:r>
           </w:p>
         </w:tc>
@@ -5458,7 +6250,7 @@
         <w:color w:val="64748B"/>
         <w:sz w:val="17"/>
       </w:rPr>
-      <w:t>Dokumentasi versi 1.2  |  4 September 2026</w:t>
+      <w:t>Dokumentasi versi 2.0  |  5 September 2026</w:t>
     </w:r>
   </w:p>
 </w:ftr>
@@ -5917,7 +6709,7 @@
       <w:rFonts w:asciiTheme="majorHAnsi" w:eastAsiaTheme="majorEastAsia" w:hAnsiTheme="majorHAnsi" w:cstheme="majorBidi" w:ascii="Calibri" w:hAnsi="Calibri"/>
       <w:b/>
       <w:bCs/>
-      <w:color w:val="2E74B5"/>
+      <w:color w:val="0F172A"/>
       <w:sz w:val="32"/>
       <w:szCs w:val="28"/>
     </w:rPr>
@@ -5941,7 +6733,7 @@
       <w:rFonts w:asciiTheme="majorHAnsi" w:eastAsiaTheme="majorEastAsia" w:hAnsiTheme="majorHAnsi" w:cstheme="majorBidi" w:ascii="Calibri" w:hAnsi="Calibri"/>
       <w:b/>
       <w:bCs/>
-      <w:color w:val="2E74B5"/>
+      <w:color w:val="0F172A"/>
       <w:sz w:val="26"/>
       <w:szCs w:val="26"/>
     </w:rPr>
@@ -5965,7 +6757,7 @@
       <w:rFonts w:asciiTheme="majorHAnsi" w:eastAsiaTheme="majorEastAsia" w:hAnsiTheme="majorHAnsi" w:cstheme="majorBidi" w:ascii="Calibri" w:hAnsi="Calibri"/>
       <w:b/>
       <w:bCs/>
-      <w:color w:val="1F4D78"/>
+      <w:color w:val="0F172A"/>
       <w:sz w:val="24"/>
     </w:rPr>
   </w:style>
@@ -6197,18 +6989,16 @@
     <w:qFormat/>
     <w:rsid w:val="00FC693F"/>
     <w:pPr>
-      <w:pBdr>
-        <w:bottom w:val="single" w:sz="8" w:space="4" w:color="4F81BD" w:themeColor="accent1"/>
-      </w:pBdr>
       <w:spacing w:after="300" w:line="240" w:lineRule="auto"/>
       <w:contextualSpacing/>
     </w:pPr>
     <w:rPr>
-      <w:rFonts w:asciiTheme="majorHAnsi" w:eastAsiaTheme="majorEastAsia" w:hAnsiTheme="majorHAnsi" w:cstheme="majorBidi"/>
-      <w:color w:val="17365D" w:themeColor="text2" w:themeShade="BF"/>
+      <w:rFonts w:asciiTheme="majorHAnsi" w:eastAsiaTheme="majorEastAsia" w:hAnsiTheme="majorHAnsi" w:cstheme="majorBidi" w:ascii="Calibri" w:hAnsi="Calibri"/>
+      <w:b/>
+      <w:color w:val="000000"/>
       <w:spacing w:val="5"/>
       <w:kern w:val="28"/>
-      <w:sz w:val="52"/>
+      <w:sz w:val="60"/>
       <w:szCs w:val="52"/>
     </w:rPr>
   </w:style>

</xml_diff>